<commit_message>
Sorting Documentation and Checkpoint
Sorting of documentation in its folder, and backing up documents before making further manual edits.
</commit_message>
<xml_diff>
--- a/Documentations/Github Pages setup information.docx
+++ b/Documentations/Github Pages setup information.docx
@@ -1,23 +1,88 @@
 
 <file path=word/document.xml><?xml version="1.0" encoding="utf-8"?>
-<w:document xmlns:wpc="http://schemas.microsoft.com/office/word/2010/wordprocessingCanvas" xmlns:mc="http://schemas.openxmlformats.org/markup-compatibility/2006" xmlns:o="urn:schemas-microsoft-com:office:office" xmlns:r="http://schemas.openxmlformats.org/officeDocument/2006/relationships" xmlns:m="http://schemas.openxmlformats.org/officeDocument/2006/math" xmlns:v="urn:schemas-microsoft-com:vml" xmlns:wp14="http://schemas.microsoft.com/office/word/2010/wordprocessingDrawing" xmlns:wp="http://schemas.openxmlformats.org/drawingml/2006/wordprocessingDrawing" xmlns:w10="urn:schemas-microsoft-com:office:word" xmlns:w="http://schemas.openxmlformats.org/wordprocessingml/2006/main" xmlns:w14="http://schemas.microsoft.com/office/word/2010/wordml" xmlns:w15="http://schemas.microsoft.com/office/word/2012/wordml" xmlns:wpg="http://schemas.microsoft.com/office/word/2010/wordprocessingGroup" xmlns:wpi="http://schemas.microsoft.com/office/word/2010/wordprocessingInk" xmlns:wne="http://schemas.microsoft.com/office/word/2006/wordml" xmlns:wps="http://schemas.microsoft.com/office/word/2010/wordprocessingShape" mc:Ignorable="w14 w15 wp14">
+<w:document xmlns:wpc="http://schemas.microsoft.com/office/word/2010/wordprocessingCanvas" xmlns:cx="http://schemas.microsoft.com/office/drawing/2014/chartex" xmlns:cx1="http://schemas.microsoft.com/office/drawing/2015/9/8/chartex" xmlns:cx2="http://schemas.microsoft.com/office/drawing/2015/10/21/chartex" xmlns:cx3="http://schemas.microsoft.com/office/drawing/2016/5/9/chartex" xmlns:cx4="http://schemas.microsoft.com/office/drawing/2016/5/10/chartex" xmlns:cx5="http://schemas.microsoft.com/office/drawing/2016/5/11/chartex" xmlns:cx6="http://schemas.microsoft.com/office/drawing/2016/5/12/chartex" xmlns:cx7="http://schemas.microsoft.com/office/drawing/2016/5/13/chartex" xmlns:cx8="http://schemas.microsoft.com/office/drawing/2016/5/14/chartex" xmlns:mc="http://schemas.openxmlformats.org/markup-compatibility/2006" xmlns:aink="http://schemas.microsoft.com/office/drawing/2016/ink" xmlns:am3d="http://schemas.microsoft.com/office/drawing/2017/model3d" xmlns:o="urn:schemas-microsoft-com:office:office" xmlns:oel="http://schemas.microsoft.com/office/2019/extlst" xmlns:r="http://schemas.openxmlformats.org/officeDocument/2006/relationships" xmlns:m="http://schemas.openxmlformats.org/officeDocument/2006/math" xmlns:v="urn:schemas-microsoft-com:vml" xmlns:wp14="http://schemas.microsoft.com/office/word/2010/wordprocessingDrawing" xmlns:wp="http://schemas.openxmlformats.org/drawingml/2006/wordprocessingDrawing" xmlns:w10="urn:schemas-microsoft-com:office:word" xmlns:w="http://schemas.openxmlformats.org/wordprocessingml/2006/main" xmlns:w14="http://schemas.microsoft.com/office/word/2010/wordml" xmlns:w15="http://schemas.microsoft.com/office/word/2012/wordml" xmlns:w16cex="http://schemas.microsoft.com/office/word/2018/wordml/cex" xmlns:w16cid="http://schemas.microsoft.com/office/word/2016/wordml/cid" xmlns:w16="http://schemas.microsoft.com/office/word/2018/wordml" xmlns:w16du="http://schemas.microsoft.com/office/word/2023/wordml/word16du" xmlns:w16sdtdh="http://schemas.microsoft.com/office/word/2020/wordml/sdtdatahash" xmlns:w16sdtfl="http://schemas.microsoft.com/office/word/2024/wordml/sdtformatlock" xmlns:w16se="http://schemas.microsoft.com/office/word/2015/wordml/symex" xmlns:wpg="http://schemas.microsoft.com/office/word/2010/wordprocessingGroup" xmlns:wpi="http://schemas.microsoft.com/office/word/2010/wordprocessingInk" xmlns:wne="http://schemas.microsoft.com/office/word/2006/wordml" xmlns:wps="http://schemas.microsoft.com/office/word/2010/wordprocessingShape" mc:Ignorable="w14 w15 w16se w16cid w16 w16cex w16sdtdh w16sdtfl w16du wp14">
   <w:body>
     <w:p>
       <w:pPr>
         <w:pStyle w:val="Title"/>
-      </w:pPr>
-      <w:r>
-        <w:t xml:space="preserve">GitHub Pages and Static Deployment Guide</w:t>
-      </w:r>
-    </w:p>
-    <w:p>
-      <w:r>
-        <w:t xml:space="preserve">Updated: 29 June 2026</w:t>
-      </w:r>
-    </w:p>
-    <w:p>
-      <w:r>
-        <w:t xml:space="preserve">Aligned with package.json, webpack.config.js, current GitHub Pages path handling and the project status reports.</w:t>
+        <w:rPr>
+          <w:sz w:val="52"/>
+          <w:szCs w:val="52"/>
+          <w:u w:val="single"/>
+        </w:rPr>
+      </w:pPr>
+      <w:r>
+        <w:rPr>
+          <w:sz w:val="52"/>
+          <w:szCs w:val="52"/>
+          <w:u w:val="single"/>
+        </w:rPr>
+        <w:t>GitHub Pages and Static Deployment Guide</w:t>
+      </w:r>
+    </w:p>
+    <w:p>
+      <w:pPr>
+        <w:rPr>
+          <w:i/>
+          <w:iCs/>
+        </w:rPr>
+      </w:pPr>
+      <w:r>
+        <w:rPr>
+          <w:i/>
+          <w:iCs/>
+        </w:rPr>
+        <w:t xml:space="preserve">Last </w:t>
+      </w:r>
+      <w:r>
+        <w:rPr>
+          <w:i/>
+          <w:iCs/>
+        </w:rPr>
+        <w:t xml:space="preserve">Updated: </w:t>
+      </w:r>
+      <w:r>
+        <w:rPr>
+          <w:i/>
+          <w:iCs/>
+        </w:rPr>
+        <w:t>6</w:t>
+      </w:r>
+      <w:r>
+        <w:rPr>
+          <w:i/>
+          <w:iCs/>
+        </w:rPr>
+        <w:t xml:space="preserve"> Ju</w:t>
+      </w:r>
+      <w:r>
+        <w:rPr>
+          <w:i/>
+          <w:iCs/>
+        </w:rPr>
+        <w:t>ly</w:t>
+      </w:r>
+      <w:r>
+        <w:rPr>
+          <w:i/>
+          <w:iCs/>
+        </w:rPr>
+        <w:t xml:space="preserve"> 2026</w:t>
+      </w:r>
+    </w:p>
+    <w:p>
+      <w:r>
+        <w:t xml:space="preserve">Aligned with </w:t>
+      </w:r>
+      <w:proofErr w:type="spellStart"/>
+      <w:proofErr w:type="gramStart"/>
+      <w:r>
+        <w:t>package.json</w:t>
+      </w:r>
+      <w:proofErr w:type="spellEnd"/>
+      <w:proofErr w:type="gramEnd"/>
+      <w:r>
+        <w:t>, webpack.config.js, current GitHub Pages path handling and the project status reports.</w:t>
       </w:r>
     </w:p>
     <w:p>
@@ -25,12 +90,32 @@
         <w:pStyle w:val="Heading1"/>
       </w:pPr>
       <w:r>
-        <w:t xml:space="preserve">1. Purpose</w:t>
-      </w:r>
-    </w:p>
-    <w:p>
-      <w:r>
-        <w:t xml:space="preserve">This guide explains how to publish the current SmartRPD web application as static files, especially through GitHub Pages. The old document described a separate source/build repository and manual SSL URL replacement; the current code already uses the live HTTPS API endpoint in source files.</w:t>
+        <w:t>1. Purpose</w:t>
+      </w:r>
+    </w:p>
+    <w:p>
+      <w:r>
+        <w:t xml:space="preserve">This guide explains how to publish the current </w:t>
+      </w:r>
+      <w:proofErr w:type="spellStart"/>
+      <w:r>
+        <w:t>SmartRPD</w:t>
+      </w:r>
+      <w:proofErr w:type="spellEnd"/>
+      <w:r>
+        <w:t xml:space="preserve"> web application as static files</w:t>
+      </w:r>
+      <w:r>
+        <w:t xml:space="preserve"> </w:t>
+      </w:r>
+      <w:r>
+        <w:t xml:space="preserve">through GitHub Pages. The </w:t>
+      </w:r>
+      <w:r>
+        <w:t>previous</w:t>
+      </w:r>
+      <w:r>
+        <w:t xml:space="preserve"> document described a separate source/build repository and manual SSL URL replacement; the current code already uses the live HTTPS API endpoint in source files.</w:t>
       </w:r>
     </w:p>
     <w:p>
@@ -38,39 +123,120 @@
         <w:pStyle w:val="Heading1"/>
       </w:pPr>
       <w:r>
-        <w:t xml:space="preserve">2. Build Output</w:t>
-      </w:r>
-    </w:p>
-    <w:p>
-      <w:pPr>
-        <w:ind w:left="720" w:hanging="360"/>
-      </w:pPr>
-      <w:r>
-        <w:t xml:space="preserve">- Run npm install if dependencies are not installed.</w:t>
-      </w:r>
-    </w:p>
-    <w:p>
-      <w:pPr>
-        <w:ind w:left="720" w:hanging="360"/>
-      </w:pPr>
-      <w:r>
-        <w:t xml:space="preserve">- Run npm run build from the repository root.</w:t>
-      </w:r>
-    </w:p>
-    <w:p>
-      <w:pPr>
-        <w:ind w:left="720" w:hanging="360"/>
-      </w:pPr>
-      <w:r>
-        <w:t xml:space="preserve">- Webpack writes the production bundle to dist/bundle.js and also emits dist/bundle.js.LICENSE.txt.</w:t>
-      </w:r>
-    </w:p>
-    <w:p>
-      <w:pPr>
-        <w:ind w:left="720" w:hanging="360"/>
-      </w:pPr>
-      <w:r>
-        <w:t xml:space="preserve">- Project_Status_Report.md records that the production-mode Webpack build completes successfully, with bundle-size warnings still requiring review.</w:t>
+        <w:t>2. Build Output</w:t>
+      </w:r>
+    </w:p>
+    <w:p>
+      <w:pPr>
+        <w:ind w:left="720" w:hanging="360"/>
+      </w:pPr>
+      <w:r>
+        <w:t xml:space="preserve">- </w:t>
+      </w:r>
+      <w:r>
+        <w:tab/>
+      </w:r>
+      <w:r>
+        <w:t xml:space="preserve">Run </w:t>
+      </w:r>
+      <w:proofErr w:type="spellStart"/>
+      <w:r>
+        <w:t>npm</w:t>
+      </w:r>
+      <w:proofErr w:type="spellEnd"/>
+      <w:r>
+        <w:t xml:space="preserve"> install if dependencies are not installed.</w:t>
+      </w:r>
+    </w:p>
+    <w:p>
+      <w:pPr>
+        <w:ind w:left="720" w:hanging="360"/>
+      </w:pPr>
+      <w:r>
+        <w:t xml:space="preserve">- </w:t>
+      </w:r>
+      <w:r>
+        <w:tab/>
+      </w:r>
+      <w:r>
+        <w:t xml:space="preserve">Run </w:t>
+      </w:r>
+      <w:proofErr w:type="spellStart"/>
+      <w:r>
+        <w:t>npm</w:t>
+      </w:r>
+      <w:proofErr w:type="spellEnd"/>
+      <w:r>
+        <w:t xml:space="preserve"> run build from the repository root.</w:t>
+      </w:r>
+    </w:p>
+    <w:p>
+      <w:pPr>
+        <w:ind w:left="720" w:hanging="360"/>
+      </w:pPr>
+      <w:r>
+        <w:t xml:space="preserve">- </w:t>
+      </w:r>
+      <w:r>
+        <w:tab/>
+      </w:r>
+      <w:r>
+        <w:t xml:space="preserve">Webpack writes the production bundle to </w:t>
+      </w:r>
+      <w:proofErr w:type="spellStart"/>
+      <w:r>
+        <w:t>dist</w:t>
+      </w:r>
+      <w:proofErr w:type="spellEnd"/>
+      <w:r>
+        <w:t xml:space="preserve">/bundle.js </w:t>
+      </w:r>
+      <w:proofErr w:type="gramStart"/>
+      <w:r>
+        <w:t>and also</w:t>
+      </w:r>
+      <w:proofErr w:type="gramEnd"/>
+      <w:r>
+        <w:t xml:space="preserve"> emits </w:t>
+      </w:r>
+      <w:proofErr w:type="spellStart"/>
+      <w:r>
+        <w:rPr>
+          <w:i/>
+          <w:iCs/>
+        </w:rPr>
+        <w:t>dist</w:t>
+      </w:r>
+      <w:proofErr w:type="spellEnd"/>
+      <w:r>
+        <w:rPr>
+          <w:i/>
+          <w:iCs/>
+        </w:rPr>
+        <w:t>/bundle.js.LICENSE.txt</w:t>
+      </w:r>
+      <w:r>
+        <w:t>.</w:t>
+      </w:r>
+    </w:p>
+    <w:p>
+      <w:pPr>
+        <w:ind w:left="720" w:hanging="360"/>
+      </w:pPr>
+      <w:r>
+        <w:t xml:space="preserve">- </w:t>
+      </w:r>
+      <w:r>
+        <w:tab/>
+      </w:r>
+      <w:r>
+        <w:t>Project_Status_Report.md records that the production-mode Webpack build completes</w:t>
+      </w:r>
+      <w:r>
+        <w:t xml:space="preserve"> </w:t>
+      </w:r>
+      <w:r>
+        <w:t>successfully, with bundle-size warnings still requiring review.</w:t>
       </w:r>
     </w:p>
     <w:p>
@@ -78,55 +244,172 @@
         <w:pStyle w:val="Heading1"/>
       </w:pPr>
       <w:r>
-        <w:t xml:space="preserve">3. Static Files Required for Deployment</w:t>
-      </w:r>
-    </w:p>
-    <w:p>
-      <w:pPr>
-        <w:ind w:left="720" w:hanging="360"/>
-      </w:pPr>
-      <w:r>
-        <w:t xml:space="preserve">- index.html must be deployed as the login entry point.</w:t>
-      </w:r>
-    </w:p>
-    <w:p>
-      <w:pPr>
-        <w:ind w:left="720" w:hanging="360"/>
-      </w:pPr>
-      <w:r>
-        <w:t xml:space="preserve">- dist/bundle.js and dist/bundle.js.LICENSE.txt must be deployed after each production build.</w:t>
-      </w:r>
-    </w:p>
-    <w:p>
-      <w:pPr>
-        <w:ind w:left="720" w:hanging="360"/>
-      </w:pPr>
-      <w:r>
-        <w:t xml:space="preserve">- src must be deployed because several pages and modules are still loaded directly from src/pages and src/js.</w:t>
-      </w:r>
-    </w:p>
-    <w:p>
-      <w:pPr>
-        <w:ind w:left="720" w:hanging="360"/>
-      </w:pPr>
-      <w:r>
-        <w:t xml:space="preserve">- css must be deployed for page styling.</w:t>
-      </w:r>
-    </w:p>
-    <w:p>
-      <w:pPr>
-        <w:ind w:left="720" w:hanging="360"/>
-      </w:pPr>
-      <w:r>
-        <w:t xml:space="preserve">- assets must be deployed for icons, jaw/tooth images, clinical-information graphics and RPD component SVGs.</w:t>
-      </w:r>
-    </w:p>
-    <w:p>
-      <w:pPr>
-        <w:ind w:left="720" w:hanging="360"/>
-      </w:pPr>
-      <w:r>
-        <w:t xml:space="preserve">- Do not deploy only bundle.js for the current repository state; the application is not a single-file bundle.</w:t>
+        <w:t>3. Static Files Required for Deployment</w:t>
+      </w:r>
+    </w:p>
+    <w:p>
+      <w:pPr>
+        <w:ind w:left="720" w:hanging="360"/>
+      </w:pPr>
+      <w:r>
+        <w:t xml:space="preserve">- </w:t>
+      </w:r>
+      <w:r>
+        <w:tab/>
+      </w:r>
+      <w:r>
+        <w:rPr>
+          <w:i/>
+          <w:iCs/>
+        </w:rPr>
+        <w:t>index.html</w:t>
+      </w:r>
+      <w:r>
+        <w:t xml:space="preserve"> must be deployed as the login entry point.</w:t>
+      </w:r>
+    </w:p>
+    <w:p>
+      <w:pPr>
+        <w:ind w:left="720" w:hanging="360"/>
+      </w:pPr>
+      <w:r>
+        <w:t xml:space="preserve">- </w:t>
+      </w:r>
+      <w:r>
+        <w:tab/>
+      </w:r>
+      <w:proofErr w:type="spellStart"/>
+      <w:r>
+        <w:rPr>
+          <w:i/>
+          <w:iCs/>
+        </w:rPr>
+        <w:t>dist</w:t>
+      </w:r>
+      <w:proofErr w:type="spellEnd"/>
+      <w:r>
+        <w:rPr>
+          <w:i/>
+          <w:iCs/>
+        </w:rPr>
+        <w:t>/bundle.js</w:t>
+      </w:r>
+      <w:r>
+        <w:t xml:space="preserve"> and </w:t>
+      </w:r>
+      <w:proofErr w:type="spellStart"/>
+      <w:r>
+        <w:rPr>
+          <w:i/>
+          <w:iCs/>
+        </w:rPr>
+        <w:t>dist</w:t>
+      </w:r>
+      <w:proofErr w:type="spellEnd"/>
+      <w:r>
+        <w:rPr>
+          <w:i/>
+          <w:iCs/>
+        </w:rPr>
+        <w:t>/bundle.js.LICENSE.txt</w:t>
+      </w:r>
+      <w:r>
+        <w:t xml:space="preserve"> must be deployed after each production build.</w:t>
+      </w:r>
+    </w:p>
+    <w:p>
+      <w:pPr>
+        <w:ind w:left="720" w:hanging="360"/>
+      </w:pPr>
+      <w:r>
+        <w:t xml:space="preserve">- </w:t>
+      </w:r>
+      <w:r>
+        <w:tab/>
+      </w:r>
+      <w:proofErr w:type="spellStart"/>
+      <w:r>
+        <w:t>src</w:t>
+      </w:r>
+      <w:proofErr w:type="spellEnd"/>
+      <w:r>
+        <w:t xml:space="preserve"> must be deployed because several pages and modules are still loaded directly from </w:t>
+      </w:r>
+      <w:proofErr w:type="spellStart"/>
+      <w:r>
+        <w:t>src</w:t>
+      </w:r>
+      <w:proofErr w:type="spellEnd"/>
+      <w:r>
+        <w:t xml:space="preserve">/pages and </w:t>
+      </w:r>
+      <w:proofErr w:type="spellStart"/>
+      <w:r>
+        <w:t>src</w:t>
+      </w:r>
+      <w:proofErr w:type="spellEnd"/>
+      <w:r>
+        <w:t>/</w:t>
+      </w:r>
+      <w:proofErr w:type="spellStart"/>
+      <w:r>
+        <w:t>js</w:t>
+      </w:r>
+      <w:proofErr w:type="spellEnd"/>
+      <w:r>
+        <w:t>.</w:t>
+      </w:r>
+    </w:p>
+    <w:p>
+      <w:pPr>
+        <w:ind w:left="720" w:hanging="360"/>
+      </w:pPr>
+      <w:r>
+        <w:t xml:space="preserve">- </w:t>
+      </w:r>
+      <w:r>
+        <w:tab/>
+      </w:r>
+      <w:proofErr w:type="spellStart"/>
+      <w:r>
+        <w:t>css</w:t>
+      </w:r>
+      <w:proofErr w:type="spellEnd"/>
+      <w:r>
+        <w:t xml:space="preserve"> must be deployed for page styling.</w:t>
+      </w:r>
+    </w:p>
+    <w:p>
+      <w:pPr>
+        <w:ind w:left="720" w:hanging="360"/>
+      </w:pPr>
+      <w:r>
+        <w:t xml:space="preserve">- </w:t>
+      </w:r>
+      <w:r>
+        <w:tab/>
+      </w:r>
+      <w:r>
+        <w:t xml:space="preserve">assets must be deployed for icons, jaw/tooth images, clinical-information graphics and RPD component </w:t>
+      </w:r>
+      <w:proofErr w:type="spellStart"/>
+      <w:r>
+        <w:t>SVGs.</w:t>
+      </w:r>
+      <w:proofErr w:type="spellEnd"/>
+    </w:p>
+    <w:p>
+      <w:pPr>
+        <w:ind w:left="720" w:hanging="360"/>
+      </w:pPr>
+      <w:r>
+        <w:t xml:space="preserve">- </w:t>
+      </w:r>
+      <w:r>
+        <w:tab/>
+      </w:r>
+      <w:r>
+        <w:t>Do not deploy only bundle.js for the current repository state; the application is not a single-file bundle.</w:t>
       </w:r>
     </w:p>
     <w:p>
@@ -134,39 +417,72 @@
         <w:pStyle w:val="Heading1"/>
       </w:pPr>
       <w:r>
-        <w:t xml:space="preserve">4. GitHub Pages Configuration</w:t>
-      </w:r>
-    </w:p>
-    <w:p>
-      <w:pPr>
-        <w:ind w:left="720" w:hanging="360"/>
-      </w:pPr>
-      <w:r>
-        <w:t xml:space="preserve">- In the GitHub repository, open Settings, then Pages.</w:t>
-      </w:r>
-    </w:p>
-    <w:p>
-      <w:pPr>
-        <w:ind w:left="720" w:hanging="360"/>
-      </w:pPr>
-      <w:r>
-        <w:t xml:space="preserve">- Select the branch and folder used for the deployed static files. If publishing from main, use root or the configured docs folder depending on the repository setup.</w:t>
-      </w:r>
-    </w:p>
-    <w:p>
-      <w:pPr>
-        <w:ind w:left="720" w:hanging="360"/>
-      </w:pPr>
-      <w:r>
-        <w:t xml:space="preserve">- Commit and push the updated static files. GitHub Pages will redeploy after the push.</w:t>
-      </w:r>
-    </w:p>
-    <w:p>
-      <w:pPr>
-        <w:ind w:left="720" w:hanging="360"/>
-      </w:pPr>
-      <w:r>
-        <w:t xml:space="preserve">- When the site is hosted under github.io, several modules use a GitHub Pages base path of /.tmp-test-web for assets. Confirm the deployed repository path matches that expectation or update the base-path logic before publishing to a different repository name.</w:t>
+        <w:t>4. GitHub Pages Configuration</w:t>
+      </w:r>
+    </w:p>
+    <w:p>
+      <w:pPr>
+        <w:ind w:left="720" w:hanging="360"/>
+      </w:pPr>
+      <w:r>
+        <w:t xml:space="preserve">- </w:t>
+      </w:r>
+      <w:r>
+        <w:tab/>
+      </w:r>
+      <w:r>
+        <w:t>In the GitHub repository, open Settings, then Pages.</w:t>
+      </w:r>
+    </w:p>
+    <w:p>
+      <w:pPr>
+        <w:ind w:left="720" w:hanging="360"/>
+      </w:pPr>
+      <w:r>
+        <w:t xml:space="preserve">- </w:t>
+      </w:r>
+      <w:r>
+        <w:tab/>
+      </w:r>
+      <w:r>
+        <w:t>Select the branch and folder used for the deployed static files. If publishing from main, use root or the configured docs folder depending on the repository setup.</w:t>
+      </w:r>
+    </w:p>
+    <w:p>
+      <w:pPr>
+        <w:ind w:left="720" w:hanging="360"/>
+      </w:pPr>
+      <w:r>
+        <w:lastRenderedPageBreak/>
+        <w:t xml:space="preserve">- </w:t>
+      </w:r>
+      <w:r>
+        <w:tab/>
+      </w:r>
+      <w:r>
+        <w:t>Commit and push the updated static files. GitHub Pages will redeploy after the push.</w:t>
+      </w:r>
+    </w:p>
+    <w:p>
+      <w:pPr>
+        <w:ind w:left="720" w:hanging="360"/>
+      </w:pPr>
+      <w:r>
+        <w:t xml:space="preserve">- </w:t>
+      </w:r>
+      <w:r>
+        <w:tab/>
+      </w:r>
+      <w:r>
+        <w:t>When the site is hosted under github.io, several modules use a GitHub Pages base path of /.</w:t>
+      </w:r>
+      <w:proofErr w:type="spellStart"/>
+      <w:r>
+        <w:t>tmp</w:t>
+      </w:r>
+      <w:proofErr w:type="spellEnd"/>
+      <w:r>
+        <w:t>-test-web for assets. Confirm the deployed repository path matches that expectation or update the base-path logic before publishing to a different repository name.</w:t>
       </w:r>
     </w:p>
     <w:p>
@@ -174,12 +490,15 @@
         <w:pStyle w:val="Heading1"/>
       </w:pPr>
       <w:r>
-        <w:t xml:space="preserve">5. API and HTTPS Endpoint</w:t>
-      </w:r>
-    </w:p>
-    <w:p>
-      <w:r>
-        <w:t xml:space="preserve">The current code calls https://live.api.smartrpdai.com/api/smartrpd. The older instruction to replace https://35.198.233.36:8090/api/smartrpd with https://api.smartrpdai.com/api/smartrpd is obsolete for this repository state. If an environment-specific API URL is required, update the relevant API constants and fetch calls deliberately, then rebuild and retest.</w:t>
+        <w:t>5. API and HTTPS Endpoint</w:t>
+      </w:r>
+    </w:p>
+    <w:p>
+      <w:pPr>
+        <w:ind w:left="720"/>
+      </w:pPr>
+      <w:r>
+        <w:t>The current code calls https://live.api.smartrpdai.com/api/smartrpd. The older instruction to replace https://35.198.233.36:8090/api/smartrpd with https://api.smartrpdai.com/api/smartrpd is obsolete for this repository state. If an environment-specific API URL is required, update the relevant API constants and fetch calls deliberately, then rebuild and retest.</w:t>
       </w:r>
     </w:p>
     <w:p>
@@ -187,55 +506,99 @@
         <w:pStyle w:val="Heading1"/>
       </w:pPr>
       <w:r>
-        <w:t xml:space="preserve">6. Post-Deployment Smoke Checks</w:t>
-      </w:r>
-    </w:p>
-    <w:p>
-      <w:pPr>
-        <w:ind w:left="720" w:hanging="360"/>
-      </w:pPr>
-      <w:r>
-        <w:t xml:space="preserve">- Open the deployed site and confirm the login page loads with CSS and SmartRPD assets.</w:t>
-      </w:r>
-    </w:p>
-    <w:p>
-      <w:pPr>
-        <w:ind w:left="720" w:hanging="360"/>
-      </w:pPr>
-      <w:r>
-        <w:t xml:space="preserve">- Sign in and confirm the case list loads from the live API.</w:t>
-      </w:r>
-    </w:p>
-    <w:p>
-      <w:pPr>
-        <w:ind w:left="720" w:hanging="360"/>
-      </w:pPr>
-      <w:r>
-        <w:t xml:space="preserve">- Open a case in 2D annotation and verify component assets render.</w:t>
-      </w:r>
-    </w:p>
-    <w:p>
-      <w:pPr>
-        <w:ind w:left="720" w:hanging="360"/>
-      </w:pPr>
-      <w:r>
-        <w:t xml:space="preserve">- Open the 3D viewer and verify jaw meshes load, the Objects menu opens, and camera controls respond.</w:t>
-      </w:r>
-    </w:p>
-    <w:p>
-      <w:pPr>
-        <w:ind w:left="720" w:hanging="360"/>
-      </w:pPr>
-      <w:r>
-        <w:t xml:space="preserve">- Check browser console/network logs for missing assets, CORS failures or API errors.</w:t>
-      </w:r>
-    </w:p>
-    <w:p>
-      <w:pPr>
-        <w:ind w:left="720" w:hanging="360"/>
-      </w:pPr>
-      <w:r>
-        <w:t xml:space="preserve">- Record the deployment URL, commit/build identifier and smoke-test result because production validation is not currently recorded in repository evidence.</w:t>
+        <w:t>6. Post-Deployment Smoke Checks</w:t>
+      </w:r>
+    </w:p>
+    <w:p>
+      <w:pPr>
+        <w:ind w:left="720" w:hanging="360"/>
+      </w:pPr>
+      <w:r>
+        <w:t xml:space="preserve">- </w:t>
+      </w:r>
+      <w:r>
+        <w:tab/>
+      </w:r>
+      <w:r>
+        <w:t xml:space="preserve">Open the deployed site and confirm the login page loads with CSS and </w:t>
+      </w:r>
+      <w:proofErr w:type="spellStart"/>
+      <w:r>
+        <w:t>SmartRPD</w:t>
+      </w:r>
+      <w:proofErr w:type="spellEnd"/>
+      <w:r>
+        <w:t xml:space="preserve"> assets.</w:t>
+      </w:r>
+    </w:p>
+    <w:p>
+      <w:pPr>
+        <w:ind w:left="720" w:hanging="360"/>
+      </w:pPr>
+      <w:r>
+        <w:t xml:space="preserve">- </w:t>
+      </w:r>
+      <w:r>
+        <w:tab/>
+      </w:r>
+      <w:r>
+        <w:t>Sign in and confirm the case list loads from the live API.</w:t>
+      </w:r>
+    </w:p>
+    <w:p>
+      <w:pPr>
+        <w:ind w:left="720" w:hanging="360"/>
+      </w:pPr>
+      <w:r>
+        <w:t xml:space="preserve">- </w:t>
+      </w:r>
+      <w:r>
+        <w:tab/>
+      </w:r>
+      <w:r>
+        <w:t>Open a case in 2D annotation and verify component assets render.</w:t>
+      </w:r>
+    </w:p>
+    <w:p>
+      <w:pPr>
+        <w:ind w:left="720" w:hanging="360"/>
+      </w:pPr>
+      <w:r>
+        <w:t xml:space="preserve">- </w:t>
+      </w:r>
+      <w:r>
+        <w:tab/>
+      </w:r>
+      <w:r>
+        <w:t>Open the 3D viewer and verify jaw meshes load, the Objects menu opens, and camera controls respond.</w:t>
+      </w:r>
+    </w:p>
+    <w:p>
+      <w:pPr>
+        <w:ind w:left="720" w:hanging="360"/>
+      </w:pPr>
+      <w:r>
+        <w:t xml:space="preserve">- </w:t>
+      </w:r>
+      <w:r>
+        <w:tab/>
+      </w:r>
+      <w:r>
+        <w:t>Check browser console/network logs for missing assets, CORS failures or API errors.</w:t>
+      </w:r>
+    </w:p>
+    <w:p>
+      <w:pPr>
+        <w:ind w:left="720" w:hanging="360"/>
+      </w:pPr>
+      <w:r>
+        <w:t xml:space="preserve">- </w:t>
+      </w:r>
+      <w:r>
+        <w:tab/>
+      </w:r>
+      <w:r>
+        <w:t>Record the deployment URL, commit/build identifier and smoke-test result because production validation is not currently recorded in repository evidence.</w:t>
       </w:r>
     </w:p>
     <w:p>
@@ -243,31 +606,57 @@
         <w:pStyle w:val="Heading1"/>
       </w:pPr>
       <w:r>
-        <w:t xml:space="preserve">7. Current Release Caveats</w:t>
-      </w:r>
-    </w:p>
-    <w:p>
-      <w:pPr>
-        <w:ind w:left="720" w:hanging="360"/>
-      </w:pPr>
-      <w:r>
-        <w:t xml:space="preserve">- Formal UAT and production sign-off remain unverified in Project_Status_Report.md.</w:t>
-      </w:r>
-    </w:p>
-    <w:p>
-      <w:pPr>
-        <w:ind w:left="720" w:hanging="360"/>
-      </w:pPr>
-      <w:r>
-        <w:t xml:space="preserve">- The build succeeds but Webpack reports bundle-size warnings; review code splitting before treating deployment performance as final.</w:t>
-      </w:r>
-    </w:p>
-    <w:p>
-      <w:pPr>
-        <w:ind w:left="720" w:hanging="360"/>
-      </w:pPr>
-      <w:r>
-        <w:t xml:space="preserve">- Some 3D API payloads are large, approximately 16 MB to 30 MB in the current status report, so initial viewer load time depends on network conditions and backend response size.</w:t>
+        <w:t>7. Current Release Caveats</w:t>
+      </w:r>
+    </w:p>
+    <w:p>
+      <w:pPr>
+        <w:ind w:left="720" w:hanging="360"/>
+      </w:pPr>
+      <w:r>
+        <w:t xml:space="preserve">- </w:t>
+      </w:r>
+      <w:r>
+        <w:tab/>
+      </w:r>
+      <w:r>
+        <w:t>Formal UAT and production sign-off remain unverified in Project_Status_Report.md.</w:t>
+      </w:r>
+    </w:p>
+    <w:p>
+      <w:pPr>
+        <w:ind w:left="720" w:hanging="360"/>
+      </w:pPr>
+      <w:r>
+        <w:t xml:space="preserve">- </w:t>
+      </w:r>
+      <w:r>
+        <w:tab/>
+      </w:r>
+      <w:r>
+        <w:t>The build succeeds but Webpack reports bundle-size warnings; review code splitting before treating deployment performance as final.</w:t>
+      </w:r>
+    </w:p>
+    <w:p>
+      <w:pPr>
+        <w:ind w:left="720" w:hanging="360"/>
+      </w:pPr>
+      <w:r>
+        <w:t xml:space="preserve">- </w:t>
+      </w:r>
+      <w:r>
+        <w:tab/>
+      </w:r>
+      <w:r>
+        <w:t xml:space="preserve">Some 3D API payloads are large, approximately 16 MB to 30 MB in the </w:t>
+      </w:r>
+      <w:proofErr w:type="gramStart"/>
+      <w:r>
+        <w:t>current status</w:t>
+      </w:r>
+      <w:proofErr w:type="gramEnd"/>
+      <w:r>
+        <w:t xml:space="preserve"> report, so initial viewer load time depends on network conditions and backend response size.</w:t>
       </w:r>
     </w:p>
     <w:sectPr>
@@ -281,7 +670,7 @@
 </file>
 
 <file path=word/numbering.xml><?xml version="1.0" encoding="utf-8"?>
-<w:numbering xmlns:wpc="http://schemas.microsoft.com/office/word/2010/wordprocessingCanvas" xmlns:cx="http://schemas.microsoft.com/office/drawing/2014/chartex" xmlns:cx1="http://schemas.microsoft.com/office/drawing/2015/9/8/chartex" xmlns:cx2="http://schemas.microsoft.com/office/drawing/2015/10/21/chartex" xmlns:cx3="http://schemas.microsoft.com/office/drawing/2016/5/9/chartex" xmlns:cx4="http://schemas.microsoft.com/office/drawing/2016/5/10/chartex" xmlns:cx5="http://schemas.microsoft.com/office/drawing/2016/5/11/chartex" xmlns:cx6="http://schemas.microsoft.com/office/drawing/2016/5/12/chartex" xmlns:cx7="http://schemas.microsoft.com/office/drawing/2016/5/13/chartex" xmlns:cx8="http://schemas.microsoft.com/office/drawing/2016/5/14/chartex" xmlns:mc="http://schemas.openxmlformats.org/markup-compatibility/2006" xmlns:aink="http://schemas.microsoft.com/office/drawing/2016/ink" xmlns:am3d="http://schemas.microsoft.com/office/drawing/2017/model3d" xmlns:o="urn:schemas-microsoft-com:office:office" xmlns:oel="http://schemas.microsoft.com/office/2019/extlst" xmlns:r="http://schemas.openxmlformats.org/officeDocument/2006/relationships" xmlns:m="http://schemas.openxmlformats.org/officeDocument/2006/math" xmlns:v="urn:schemas-microsoft-com:vml" xmlns:wp14="http://schemas.microsoft.com/office/word/2010/wordprocessingDrawing" xmlns:wp="http://schemas.openxmlformats.org/drawingml/2006/wordprocessingDrawing" xmlns:w10="urn:schemas-microsoft-com:office:word" xmlns:w="http://schemas.openxmlformats.org/wordprocessingml/2006/main" xmlns:w14="http://schemas.microsoft.com/office/word/2010/wordml" xmlns:w15="http://schemas.microsoft.com/office/word/2012/wordml" xmlns:w16cex="http://schemas.microsoft.com/office/word/2018/wordml/cex" xmlns:w16cid="http://schemas.microsoft.com/office/word/2016/wordml/cid" xmlns:w16="http://schemas.microsoft.com/office/word/2018/wordml" xmlns:w16du="http://schemas.microsoft.com/office/word/2023/wordml/word16du" xmlns:w16sdtdh="http://schemas.microsoft.com/office/word/2020/wordml/sdtdatahash" xmlns:w16se="http://schemas.microsoft.com/office/word/2015/wordml/symex" xmlns:wpg="http://schemas.microsoft.com/office/word/2010/wordprocessingGroup" xmlns:wpi="http://schemas.microsoft.com/office/word/2010/wordprocessingInk" xmlns:wne="http://schemas.microsoft.com/office/word/2006/wordml" xmlns:wps="http://schemas.microsoft.com/office/word/2010/wordprocessingShape" mc:Ignorable="w14 w15 w16se w16cid w16 w16cex w16sdtdh w16du wp14">
+<w:numbering xmlns:wpc="http://schemas.microsoft.com/office/word/2010/wordprocessingCanvas" xmlns:cx="http://schemas.microsoft.com/office/drawing/2014/chartex" xmlns:cx1="http://schemas.microsoft.com/office/drawing/2015/9/8/chartex" xmlns:cx2="http://schemas.microsoft.com/office/drawing/2015/10/21/chartex" xmlns:cx3="http://schemas.microsoft.com/office/drawing/2016/5/9/chartex" xmlns:cx4="http://schemas.microsoft.com/office/drawing/2016/5/10/chartex" xmlns:cx5="http://schemas.microsoft.com/office/drawing/2016/5/11/chartex" xmlns:cx6="http://schemas.microsoft.com/office/drawing/2016/5/12/chartex" xmlns:cx7="http://schemas.microsoft.com/office/drawing/2016/5/13/chartex" xmlns:cx8="http://schemas.microsoft.com/office/drawing/2016/5/14/chartex" xmlns:mc="http://schemas.openxmlformats.org/markup-compatibility/2006" xmlns:aink="http://schemas.microsoft.com/office/drawing/2016/ink" xmlns:am3d="http://schemas.microsoft.com/office/drawing/2017/model3d" xmlns:o="urn:schemas-microsoft-com:office:office" xmlns:oel="http://schemas.microsoft.com/office/2019/extlst" xmlns:r="http://schemas.openxmlformats.org/officeDocument/2006/relationships" xmlns:m="http://schemas.openxmlformats.org/officeDocument/2006/math" xmlns:v="urn:schemas-microsoft-com:vml" xmlns:wp14="http://schemas.microsoft.com/office/word/2010/wordprocessingDrawing" xmlns:wp="http://schemas.openxmlformats.org/drawingml/2006/wordprocessingDrawing" xmlns:w10="urn:schemas-microsoft-com:office:word" xmlns:w="http://schemas.openxmlformats.org/wordprocessingml/2006/main" xmlns:w14="http://schemas.microsoft.com/office/word/2010/wordml" xmlns:w15="http://schemas.microsoft.com/office/word/2012/wordml" xmlns:w16cex="http://schemas.microsoft.com/office/word/2018/wordml/cex" xmlns:w16cid="http://schemas.microsoft.com/office/word/2016/wordml/cid" xmlns:w16="http://schemas.microsoft.com/office/word/2018/wordml" xmlns:w16du="http://schemas.microsoft.com/office/word/2023/wordml/word16du" xmlns:w16sdtdh="http://schemas.microsoft.com/office/word/2020/wordml/sdtdatahash" xmlns:w16sdtfl="http://schemas.microsoft.com/office/word/2024/wordml/sdtformatlock" xmlns:w16se="http://schemas.microsoft.com/office/word/2015/wordml/symex" xmlns:wpg="http://schemas.microsoft.com/office/word/2010/wordprocessingGroup" xmlns:wpi="http://schemas.microsoft.com/office/word/2010/wordprocessingInk" xmlns:wne="http://schemas.microsoft.com/office/word/2006/wordml" xmlns:wps="http://schemas.microsoft.com/office/word/2010/wordprocessingShape" mc:Ignorable="w14 w15 w16se w16cid w16 w16cex w16sdtdh w16sdtfl w16du wp14">
   <w:abstractNum w:abstractNumId="0" w15:restartNumberingAfterBreak="0">
     <w:nsid w:val="5F371CEE"/>
     <w:multiLevelType w:val="hybridMultilevel"/>
@@ -470,7 +859,7 @@
 </file>
 
 <file path=word/styles.xml><?xml version="1.0" encoding="utf-8"?>
-<w:styles xmlns:mc="http://schemas.openxmlformats.org/markup-compatibility/2006" xmlns:r="http://schemas.openxmlformats.org/officeDocument/2006/relationships" xmlns:w="http://schemas.openxmlformats.org/wordprocessingml/2006/main" xmlns:w14="http://schemas.microsoft.com/office/word/2010/wordml" xmlns:w15="http://schemas.microsoft.com/office/word/2012/wordml" xmlns:w16cex="http://schemas.microsoft.com/office/word/2018/wordml/cex" xmlns:w16cid="http://schemas.microsoft.com/office/word/2016/wordml/cid" xmlns:w16="http://schemas.microsoft.com/office/word/2018/wordml" xmlns:w16du="http://schemas.microsoft.com/office/word/2023/wordml/word16du" xmlns:w16sdtdh="http://schemas.microsoft.com/office/word/2020/wordml/sdtdatahash" xmlns:w16se="http://schemas.microsoft.com/office/word/2015/wordml/symex" mc:Ignorable="w14 w15 w16se w16cid w16 w16cex w16sdtdh w16du">
+<w:styles xmlns:mc="http://schemas.openxmlformats.org/markup-compatibility/2006" xmlns:r="http://schemas.openxmlformats.org/officeDocument/2006/relationships" xmlns:w="http://schemas.openxmlformats.org/wordprocessingml/2006/main" xmlns:w14="http://schemas.microsoft.com/office/word/2010/wordml" xmlns:w15="http://schemas.microsoft.com/office/word/2012/wordml" xmlns:w16cex="http://schemas.microsoft.com/office/word/2018/wordml/cex" xmlns:w16cid="http://schemas.microsoft.com/office/word/2016/wordml/cid" xmlns:w16="http://schemas.microsoft.com/office/word/2018/wordml" xmlns:w16du="http://schemas.microsoft.com/office/word/2023/wordml/word16du" xmlns:w16sdtdh="http://schemas.microsoft.com/office/word/2020/wordml/sdtdatahash" xmlns:w16sdtfl="http://schemas.microsoft.com/office/word/2024/wordml/sdtformatlock" xmlns:w16se="http://schemas.microsoft.com/office/word/2015/wordml/symex" mc:Ignorable="w14 w15 w16se w16cid w16 w16cex w16sdtdh w16sdtfl w16du">
   <w:docDefaults>
     <w:rPrDefault>
       <w:rPr>
@@ -1072,6 +1461,7 @@
   <w:style w:type="character" w:default="1" w:styleId="DefaultParagraphFont">
     <w:name w:val="Default Paragraph Font"/>
     <w:uiPriority w:val="1"/>
+    <w:semiHidden/>
     <w:unhideWhenUsed/>
   </w:style>
   <w:style w:type="table" w:default="1" w:styleId="TableNormal">

</xml_diff>